<commit_message>
edits for length and "confidence"
</commit_message>
<xml_diff>
--- a/docs/manuscript/sampling_uncertainty_mpm_main.docx
+++ b/docs/manuscript/sampling_uncertainty_mpm_main.docx
@@ -149,7 +149,7 @@
         </w:numPr>
       </w:pPr>
       <w:r>
-        <w:t xml:space="preserve">Using a subset of studies from the COMPADRE Plant Matrix Database for which transition-specific sample sizes could be obtained, we reconstructed sampling distributions for transition rates and derived demographic parameters, and conducted three related analyses with and without explicit sampling uncertainty: (i) a multi-species comparative analysis of life expectancy-shape relationships, (ii) a single-species time-series analysis of climate-demography effects, and (iii) a simulation study with known truth, each fit with and without explicit sampling uncertainty.</w:t>
+        <w:t xml:space="preserve">Using a subset of studies from the COMPADRE Plant Matrix Database for which transition-specific sample sizes could be obtained, we reconstructed sampling distributions for transition rates and derived demographic parameters, and conducted three related analyses: (i) a multi-species comparative analysis of life expectancy-shape relationships, (ii) a single-species time-series analysis of climate-demography effects, and (iii) a simulation study with known truth that compares how models account for count sampling and year-to-year variation.</w:t>
       </w:r>
     </w:p>
     <w:p>
@@ -160,7 +160,7 @@
         </w:numPr>
       </w:pPr>
       <w:r>
-        <w:t xml:space="preserve">The effects of sampling uncertainty were strongly trait-dependent. Sampling uncertainty had little influence on integrated demographic metrics such as population growth rate, but accounted for a substantial fraction of the total variation in traits related to mortality trajectories, particularly the shape of the mortality distribution. In these cases, point estimates were often systematically displaced from their underlying sampling distributions due to boundary estimates of stage-specific survival (i.e. survival probabilities near 0 or 1), which are common in published matrices. By contrast, inference in a within-species analysis of weather effects on vital rates was largely unaffected, whereas the simulation study showed that point-estimate count models can become overconfident even when bias remains low.</w:t>
+        <w:t xml:space="preserve">The effects of sampling uncertainty were strongly trait-dependent. Point estimates and posterior means had similar dispersion for integrated demographic metrics such as population growth rate, but point estimates were substantially more dispersed for traits related to mortality trajectories, particularly the shape of the mortality distribution. In these cases, point estimates were often systematically displaced from their underlying sampling distributions due to boundary estimates of stage-specific survival (i.e. survival probabilities near 0 or 1), which are common in published matrices. By contrast, inference in a within-species analysis of weather effects on vital rates was largely unaffected, whereas the simulation study showed that point-estimate count models can become overconfident even when bias remains low.</w:t>
       </w:r>
     </w:p>
     <w:p>
@@ -171,7 +171,7 @@
         </w:numPr>
       </w:pPr>
       <w:r>
-        <w:t xml:space="preserve">Together, these analyses show that ignoring sampling uncertainty does not universally compromise inference from published projection matrices, but can yield fragile or biased conclusions for certain demographic traits and overconfident interval estimates in count-based models. We identify structural features of MPMs and analyses that may indicate heightened sensitivity to sampling uncertainty, and discuss implications for researchers using compiled demographic databases.</w:t>
+        <w:t xml:space="preserve">Together, these analyses show that ignoring sampling uncertainty does not universally compromise inference from published projection matrices, but can yield fragile or biased conclusions for certain demographic traits; the simulation also shows that omitting year-to-year variation can produce overconfident interval estimates in count-based models. We identify structural features of MPMs and analyses that may indicate heightened sensitivity to sampling uncertainty, and discuss implications for researchers using compiled demographic databases.</w:t>
       </w:r>
     </w:p>
     <w:p>
@@ -179,7 +179,7 @@
         <w:pStyle w:val="FirstParagraph"/>
       </w:pPr>
       <w:r>
-        <w:t xml:space="preserve">Keywords: age-from-stage methods; parametric bootstrapping; estimation bias; parameter uncertainty; stage-structured models; sensitivity analysis; plant demography; life history traits</w:t>
+        <w:t xml:space="preserve">Keywords: age-from-stage methods; conjugate priors; estimation bias; parameter uncertainty; stage-structured models; sensitivity analysis; plant demography; life history traits</w:t>
       </w:r>
     </w:p>
     <w:p>
@@ -319,7 +319,7 @@
         <w:pStyle w:val="FirstParagraph"/>
       </w:pPr>
       <w:r>
-        <w:t xml:space="preserve">We used an earlier version of COMPADRE to define a target-study screen based on the following criteria: studies published from 2010 onwards; species of common perennial growth forms (herbaceous, shrub, tree, palm, and succulent); wild populations not subjected to experimental treatments; and MPMs with three or more stage classes and a one-year projection interval. Re-running that screen with COMPADRE version 6.26.3.0 (created Mar_11_2026) yields 92 post-2010 target studies. Of these, 23 are represented in the current final dataset used here; most exclusions reflected insufficient reporting of transition-specific sample sizes, and a small number used estimation methods incompatible with our bootstrapping approach (e.g. mark-recapture or multi-stage vital rate products). Three additional post-2010 studies in the final dataset (</w:t>
+        <w:t xml:space="preserve">We used an earlier version of COMPADRE to define a target-study screen based on the following criteria: studies published from 2010 onwards; species of common perennial growth forms (herbaceous, shrub, tree, palm, and succulent); wild populations not subjected to experimental treatments; and MPMs with three or more stage classes and a one-year projection interval. Re-running that screen with COMPADRE version 6.26.3.0 (created Mar_11_2026) yields 92 post-2010 target studies. Of these, 23 are represented in the current final dataset used here; most exclusions reflected insufficient reporting of transition-specific sample sizes, and a small number used estimation methods incompatible with our uncertainty-reconstruction approach (e.g. mark-recapture or multi-stage vital rate products). Three additional post-2010 studies in the final dataset (</w:t>
       </w:r>
       <w:r>
         <w:rPr>
@@ -855,15 +855,7 @@
         <w:pStyle w:val="BodyText"/>
       </w:pPr>
       <w:r>
-        <w:t xml:space="preserve">Alternatively, reproductive transitions may be split into multiple lower-level vital rates (e.g. numbers of flowers per plant, fruits per flower, and seeds per fruit, seed survival probability, and seed germination probability), which are typically estimated from separate samples, and then multiplied to derive the overall transition rate. In some studies, transition rates are estimated using more nuanced statistical models that partially pool estimates across stage classes, sites, and/or years, or incorporate additional variables external to the MPM.</w:t>
-      </w:r>
-    </w:p>
-    <w:p>
-      <w:pPr>
-        <w:pStyle w:val="BodyText"/>
-      </w:pPr>
-      <w:r>
-        <w:t xml:space="preserve">In such models, uncertainty may differ from the simple count-based setting considered here. Partial pooling in hierarchical vital-rate models, IPMs, or related formulations will often reduce the variance of weakly informed transition estimates, but may also induce stronger correlations across transitions; in those cases, uncertainty should ideally be propagated from the joint posterior of the fitted vital-rate model rather than by treating transition estimates as independent. Our reconstructions therefore approximate the uncertainty available to a secondary user of the published matrix and accompanying sample-size information, rather than the full joint uncertainty from the original fitted model.</w:t>
+        <w:t xml:space="preserve">Alternatively, reproductive transitions may be decomposed into lower-level vital rates (e.g. flowers per plant, seeds per fruit, and germination probability) estimated from separate samples, or transition rates may be fitted with models that partially pool estimates across stage classes, sites, or years, as in hierarchical vital-rate models and integral projection models (IPMs). Uncertainty in such models can differ from the simple count-based setting considered here: partial pooling often reduces the variance of weakly informed estimates but can induce stronger correlations across transitions, so uncertainty should ideally be propagated from the joint posterior of the fitted model. Our reconstructions therefore approximate the uncertainty available to a secondary user of the published matrix and its sample-size information, rather than the full joint uncertainty from the original fitted model.</w:t>
       </w:r>
     </w:p>
     <w:bookmarkEnd w:id="25"/>
@@ -881,7 +873,7 @@
         <w:pStyle w:val="FirstParagraph"/>
       </w:pPr>
       <w:r>
-        <w:t xml:space="preserve">Techniques for estimating sampling uncertainty in transition rates and derived parameters are reviewed in Caswell (2001, Ch. 12). The method we use here is parametric bootstrapping, in which we generate a sampling distribution for each MPM by taking 2,000 independent random draws from the sampling distribution of each underlying transition rate. For example, if</w:t>
+        <w:t xml:space="preserve">Techniques for estimating sampling uncertainty in transition rates and derived parameters are reviewed in Caswell (2001, Ch. 12). We reconstruct uncertainty using direct draws from conjugate posterior distributions, rather than a parametric bootstrap: 2,000 draws per MPM for the illustrative example and 1,000 for analysis 1. Hereafter, “sampling distributions” refers to these reconstructed posterior uncertainty distributions. Survival-related transitions are drawn jointly within each origin-stage column using a Dirichlet prior with all concentration parameters equal to 1, including death; reproductive rates use independent flat priors on the non-negative rate scale (Supplementary Methods section S1.1). For example, if</w:t>
       </w:r>
       <w:r>
         <w:t xml:space="preserve"> </w:t>
@@ -1169,7 +1161,7 @@
         </m:r>
       </m:oMath>
       <w:r>
-        <w:t xml:space="preserve">. Use of a Poisson distribution for fecundity might under-capture overdispersion in species with highly variable fecundity. We distinguish structural zeros (biologically impossible transitions) from sampling zeros (possible but unobserved transitions): structural zeros are fixed at 0 in all bootstrap draws, whereas sampling zeros are modelled with the same likelihood-based uncertainty framework as non-zero transitions.</w:t>
+        <w:t xml:space="preserve">. Use of a Poisson distribution for fecundity might under-capture overdispersion in species with highly variable fecundity.</w:t>
       </w:r>
     </w:p>
     <w:bookmarkEnd w:id="26"/>
@@ -1187,7 +1179,7 @@
         <w:pStyle w:val="FirstParagraph"/>
       </w:pPr>
       <w:r>
-        <w:t xml:space="preserve">We chose parametric bootstrapping because the sampling distributions of survival and reproductive transitions follow well-characterised probability models (multinomial and Poisson, respectively) whose parameters can be directly estimated from the transition frequencies reported in source studies. This makes parametric bootstrapping more tractable than MCMC for our scale of analysis and more principled than the empirical bootstrap, which cannot generate variation when all individuals in a stage class experience the same outcome (e.g. all survive), a situation common in published matrices. When a stage-specific sample size was recovered as zero, we retained the published point-estimate transition column unchanged in all bootstrap draws rather than treating it as a structural zero. In such cases, the matrix remains usable in the same way it would be in a comparative database analysis, but no additional sampling variation is propagated for that unsupported column.</w:t>
+        <w:t xml:space="preserve">This conjugate posterior approach avoids MCMC and, unlike a bootstrap of the reported point estimates, permits uncertainty in allowed outcomes that were not observed, including death when all sampled individuals survived, so it does not force every draw to reproduce boundary point estimates; the resulting uncertainty depends on the specified priors and allowed-transition structure. Zero-valued matrix entries are fixed at 0 unless included in the allowed-transition mask, so the implementation does not generally distinguish sampling zeros from structural zeros and may understate uncertainty in unobserved transitions. When a stage sample size is missing, the published transition column is retained unchanged; when it is explicitly zero, the corresponding column is returned as missing rather than treated as a structural zero. Such columns therefore contribute no reconstructed sampling variation, and zero-sample-size columns yield no usable posterior draws.</w:t>
       </w:r>
     </w:p>
     <w:bookmarkStart w:id="27" w:name="illustrative-example"/>
@@ -2264,7 +2256,7 @@
         <w:t xml:space="preserve"> </w:t>
       </w:r>
       <w:r>
-        <w:t xml:space="preserve">denotes death as the complementary non-survival outcome for that origin stage. In the implemented bootstrap, death is resampled jointly with the living transitions in each</w:t>
+        <w:t xml:space="preserve">denotes death as the complementary non-survival outcome for that origin stage. In the posterior sampling, death probability is drawn jointly with the living-transition probabilities in each</w:t>
       </w:r>
       <w:r>
         <w:t xml:space="preserve"> </w:t>
@@ -2335,7 +2327,7 @@
         <w:t xml:space="preserve"> </w:t>
       </w:r>
       <w:r>
-        <w:t xml:space="preserve">and contains only reproductive transitions. From these counts, the sampling distributions of the underlying transition rates are:</w:t>
+        <w:t xml:space="preserve">and contains only reproductive transitions. The count likelihoods used to reconstruct transition-rate uncertainty are:</w:t>
       </w:r>
     </w:p>
     <w:p>
@@ -2886,7 +2878,7 @@
         <w:pStyle w:val="FirstParagraph"/>
       </w:pPr>
       <w:r>
-        <w:t xml:space="preserve">To create a sampling distribution for the focal MPM, we take 2,000 independent draws from the sampling distributions implied above (see Supplementary Methods section S1.1 for a full workflow description). At each iteration, we arrange the drawn transition rates into the form of our MPM and then use that MPM draw to calculate our derived parameter(s) of interest. After 2,000 iterations, we therefore have 2,000 independent draws from the sampling distribution of each transition rate and derived parameter.</w:t>
+        <w:t xml:space="preserve">To create a sampling distribution for the focal MPM, we take 2,000 independent draws from the posterior distributions obtained using these likelihoods and the priors described above (see Supplementary Methods section S1.1 for a full workflow description). At each iteration, we arrange the drawn transition rates into the form of our MPM and then use that MPM draw to calculate our derived parameter(s) of interest. After 2,000 iterations, we therefore have 2,000 independent draws from the sampling distribution of each transition rate and derived parameter.</w:t>
       </w:r>
     </w:p>
     <w:p>
@@ -2903,7 +2895,7 @@
         <w:t xml:space="preserve">1</w:t>
       </w:r>
       <w:r>
-        <w:t xml:space="preserve">). For instance, the sample estimate for the vegetative-reproductive growth transition is 0.22 (2/9), but the upper bound of the 95% bootstrap interval suggests this transition rate could plausibly be as high as 0.45 in the population at large. Correspondingly, there is substantial sampling uncertainty in some derived parameters (Fig.</w:t>
+        <w:t xml:space="preserve">). For instance, the sample estimate for the vegetative-reproductive growth transition is 0.22 (2/9), but the upper bound of the 95% credible interval suggests this transition rate could plausibly be as high as 0.45 in the population at large. Correspondingly, there is substantial sampling uncertainty in some derived parameters (Fig.</w:t>
       </w:r>
       <w:r>
         <w:t xml:space="preserve"> </w:t>
@@ -2912,7 +2904,7 @@
         <w:t xml:space="preserve">2</w:t>
       </w:r>
       <w:r>
-        <w:t xml:space="preserve">). Based on the 95% bootstrap interval bounds, the equilibrium population growth rate could be as low as –17% per year or as high as +1% per year; life expectancy could be as low as 3.5 years or as high as 18.2 years; and the reproductive value of the vegetative stage class could be 22% lower than that of the seedling stage or 1460% higher.</w:t>
+        <w:t xml:space="preserve">). Based on the 95% credible interval bounds, the equilibrium population growth rate could be as low as –17% per year or as high as +1% per year; life expectancy could be as low as 3.5 years or as high as 18.2 years; and the reproductive value of the vegetative stage class could be 22% lower than that of the seedling stage or 1460% higher.</w:t>
       </w:r>
     </w:p>
     <w:p>
@@ -2920,7 +2912,7 @@
         <w:pStyle w:val="BodyText"/>
       </w:pPr>
       <w:r>
-        <w:t xml:space="preserve">We chose three analyses to illuminate contrasting contexts in which sampling uncertainty may be relevant. Analysis 1 is a comparative analysis across many species and populations, in which derived traits depend heavily on long-term survivorship inferred indirectly from stage-structured matrices, precisely the setting in which sampling uncertainty might compound. Analysis 2, by contrast, is a within-species time-series analysis in which the response variable is a directly observed count, the statistical model is closely tied to the raw data, and the question concerns an environmental driver rather than a demographic trait per se. Analysis 3 is a simulation study with known truth, designed to test whether the apparent robustness in Analysis 2 generalises: specifically, whether accounting for sampling uncertainty improves estimation bias and interval calibration across a factorial range of effect sizes and sample sizes. Together, the three analyses bracket a range of typical uses of published MPMs and allow us to ask whether the consequences of sampling uncertainty are consistent across contexts or depend on the nature of the analysis.</w:t>
+        <w:t xml:space="preserve">We chose three analyses to illuminate contrasting contexts in which sampling uncertainty may be relevant. Analysis 1 is a comparative analysis across many species and populations, in which derived traits depend heavily on long-term survivorship inferred indirectly from stage-structured matrices, precisely the setting in which sampling uncertainty might compound. Analysis 2, by contrast, is a within-species time-series analysis in which the response variable is a directly observed count, the statistical model is closely tied to the raw data, and the question concerns an environmental driver rather than a demographic trait per se. Analysis 3 is a simulation study with known truth, designed to test whether count models remain well calibrated when year-to-year process variation is present across a factorial range of effect sizes and sample sizes. Together, the three analyses bracket a range of typical uses of published MPMs and examine how modelled sources of uncertainty affect inference in different contexts.</w:t>
       </w:r>
     </w:p>
     <w:bookmarkEnd w:id="27"/>
@@ -3112,7 +3104,7 @@
         <w:pStyle w:val="BodyText"/>
       </w:pPr>
       <w:r>
-        <w:t xml:space="preserve">Across the compiled analysis set, 5 population-level matrices (representing 5 populations) had no usable recovered stage-specific sample sizes at all and therefore could not contribute to uncertainty-propagation analyses that require reconstructed sampling distributions.</w:t>
+        <w:t xml:space="preserve">Across the compiled analysis set, 5 population-level matrices (representing 5 populations) had no usable recovered stage-specific sample sizes. Where retained, their unsupported columns were held fixed rather than assigned reconstructed sampling uncertainty.</w:t>
       </w:r>
     </w:p>
     <w:p>
@@ -3789,7 +3781,7 @@
         </m:sSub>
       </m:oMath>
       <w:r>
-        <w:t xml:space="preserve">, which are now treated as unknown quantities estimated from their bootstrap-derived sampling distributions rather than as fixed plug-in values:</w:t>
+        <w:t xml:space="preserve">, which are now treated as unknown quantities estimated from their reconstructed posterior distributions rather than as fixed plug-in values:</w:t>
       </w:r>
     </w:p>
     <w:p>
@@ -4201,7 +4193,7 @@
         <w:pStyle w:val="BodyText"/>
       </w:pPr>
       <w:r>
-        <w:t xml:space="preserve">In supplementary analyses, we estimated the variance components of life expectancy, shape, and other life history traits using a sampling-to-other variance ratio: the proportion of total observed variation in a demographic parameter attributable to transition-rate sampling uncertainty relative to variation from all other sources (principally biological variation among populations and species). For each parameter we partitioned total variance into a sampling component, estimated as the mean of the within-MPM sampling variances derived from the bootstrap distributions, and a residual component representing the remainder. A ratio greater than 1 indicates that sampling uncertainty exceeds biological variation; a ratio less than 1 indicates that biological variation dominates. Full details are given in Supplementary Methods section S1.5 and Table</w:t>
+        <w:t xml:space="preserve">In supplementary analyses, we compared the variance across population-level MPM entries of each parameter derived from matrix point estimates with the variance of its reconstructed posterior means. A ratio greater than 1 indicates that point estimates are more dispersed than posterior means; it does not partition sampling and biological variance. We obtained 95% intervals by paired bootstrap resampling of entries (Supplementary Methods section S1.5; Table</w:t>
       </w:r>
       <w:r>
         <w:t xml:space="preserve"> </w:t>
@@ -4210,7 +4202,7 @@
         <w:t xml:space="preserve">1</w:t>
       </w:r>
       <w:r>
-        <w:t xml:space="preserve">.</w:t>
+        <w:t xml:space="preserve">).</w:t>
       </w:r>
     </w:p>
     <w:bookmarkEnd w:id="28"/>
@@ -5561,262 +5553,7 @@
         <w:pStyle w:val="BodyText"/>
       </w:pPr>
       <w:r>
-        <w:t xml:space="preserve">We used the same coefficient prior and covariance structure (Eqs. (13) and (14)):</w:t>
-      </w:r>
-    </w:p>
-    <w:p>
-      <w:pPr>
-        <w:pStyle w:val="BodyText"/>
-      </w:pPr>
-      <m:oMathPara>
-        <m:oMathParaPr>
-          <m:jc m:val="center"/>
-        </m:oMathParaPr>
-        <m:oMath>
-          <m:r>
-            <m:t>b</m:t>
-          </m:r>
-          <m:r>
-            <m:rPr>
-              <m:sty m:val="p"/>
-            </m:rPr>
-            <m:t>∼</m:t>
-          </m:r>
-          <m:r>
-            <m:rPr>
-              <m:nor/>
-              <m:sty m:val="p"/>
-            </m:rPr>
-            <m:t>MVN</m:t>
-          </m:r>
-          <m:r>
-            <m:rPr>
-              <m:sty m:val="p"/>
-            </m:rPr>
-            <m:t>(</m:t>
-          </m:r>
-          <m:sSub>
-            <m:e>
-              <m:r>
-                <m:t>μ</m:t>
-              </m:r>
-            </m:e>
-            <m:sub>
-              <m:r>
-                <m:t>b</m:t>
-              </m:r>
-            </m:sub>
-          </m:sSub>
-          <m:r>
-            <m:rPr>
-              <m:sty m:val="p"/>
-            </m:rPr>
-            <m:t>,</m:t>
-          </m:r>
-          <m:r>
-            <m:rPr>
-              <m:sty m:val="bi"/>
-            </m:rPr>
-            <m:t>K</m:t>
-          </m:r>
-          <m:r>
-            <m:rPr>
-              <m:sty m:val="p"/>
-            </m:rPr>
-            <m:t>)</m:t>
-          </m:r>
-          <m:r>
-            <m:rPr>
-              <m:sty m:val="p"/>
-            </m:rPr>
-            <m:t>,</m:t>
-          </m:r>
-          <m:r>
-            <m:t>  </m:t>
-          </m:r>
-          <m:r>
-            <m:rPr>
-              <m:sty m:val="p"/>
-            </m:rPr>
-            <m:t>(</m:t>
-          </m:r>
-          <m:r>
-            <m:t>13</m:t>
-          </m:r>
-          <m:r>
-            <m:rPr>
-              <m:sty m:val="p"/>
-            </m:rPr>
-            <m:t>)</m:t>
-          </m:r>
-        </m:oMath>
-      </m:oMathPara>
-    </w:p>
-    <w:p>
-      <w:pPr>
-        <w:pStyle w:val="FirstParagraph"/>
-      </w:pPr>
-      <w:r>
-        <w:t xml:space="preserve">and</w:t>
-      </w:r>
-    </w:p>
-    <w:p>
-      <w:pPr>
-        <w:pStyle w:val="BodyText"/>
-      </w:pPr>
-      <m:oMathPara>
-        <m:oMathParaPr>
-          <m:jc m:val="center"/>
-        </m:oMathParaPr>
-        <m:oMath>
-          <m:sSub>
-            <m:e>
-              <m:r>
-                <m:t>K</m:t>
-              </m:r>
-            </m:e>
-            <m:sub>
-              <m:r>
-                <m:t>i</m:t>
-              </m:r>
-              <m:r>
-                <m:rPr>
-                  <m:sty m:val="p"/>
-                </m:rPr>
-                <m:t>,</m:t>
-              </m:r>
-              <m:r>
-                <m:t>j</m:t>
-              </m:r>
-            </m:sub>
-          </m:sSub>
-          <m:r>
-            <m:rPr>
-              <m:sty m:val="p"/>
-            </m:rPr>
-            <m:t>=</m:t>
-          </m:r>
-          <m:sSup>
-            <m:e>
-              <m:r>
-                <m:t>η</m:t>
-              </m:r>
-            </m:e>
-            <m:sup>
-              <m:r>
-                <m:t>2</m:t>
-              </m:r>
-            </m:sup>
-          </m:sSup>
-          <m:r>
-            <m:rPr>
-              <m:sty m:val="p"/>
-            </m:rPr>
-            <m:t>exp</m:t>
-          </m:r>
-          <m:r>
-            <m:t>​</m:t>
-          </m:r>
-          <m:d>
-            <m:dPr>
-              <m:begChr m:val="("/>
-              <m:sepChr m:val=""/>
-              <m:endChr m:val=")"/>
-              <m:grow/>
-            </m:dPr>
-            <m:e>
-              <m:r>
-                <m:rPr>
-                  <m:sty m:val="p"/>
-                </m:rPr>
-                <m:t>−</m:t>
-              </m:r>
-              <m:r>
-                <m:t>0.5</m:t>
-              </m:r>
-              <m:r>
-                <m:t> </m:t>
-              </m:r>
-              <m:sSup>
-                <m:e>
-                  <m:r>
-                    <m:t>ρ</m:t>
-                  </m:r>
-                </m:e>
-                <m:sup>
-                  <m:r>
-                    <m:t>2</m:t>
-                  </m:r>
-                </m:sup>
-              </m:sSup>
-              <m:r>
-                <m:rPr>
-                  <m:sty m:val="p"/>
-                </m:rPr>
-                <m:t>(</m:t>
-              </m:r>
-              <m:r>
-                <m:t>j</m:t>
-              </m:r>
-              <m:r>
-                <m:rPr>
-                  <m:sty m:val="p"/>
-                </m:rPr>
-                <m:t>−</m:t>
-              </m:r>
-              <m:r>
-                <m:t>i</m:t>
-              </m:r>
-              <m:sSup>
-                <m:e>
-                  <m:r>
-                    <m:rPr>
-                      <m:sty m:val="p"/>
-                    </m:rPr>
-                    <m:t>)</m:t>
-                  </m:r>
-                </m:e>
-                <m:sup>
-                  <m:r>
-                    <m:t>2</m:t>
-                  </m:r>
-                </m:sup>
-              </m:sSup>
-            </m:e>
-          </m:d>
-          <m:r>
-            <m:rPr>
-              <m:sty m:val="p"/>
-            </m:rPr>
-            <m:t>,</m:t>
-          </m:r>
-          <m:r>
-            <m:t>  </m:t>
-          </m:r>
-          <m:r>
-            <m:rPr>
-              <m:sty m:val="p"/>
-            </m:rPr>
-            <m:t>(</m:t>
-          </m:r>
-          <m:r>
-            <m:t>14</m:t>
-          </m:r>
-          <m:r>
-            <m:rPr>
-              <m:sty m:val="p"/>
-            </m:rPr>
-            <m:t>)</m:t>
-          </m:r>
-        </m:oMath>
-      </m:oMathPara>
-    </w:p>
-    <w:p>
-      <w:pPr>
-        <w:pStyle w:val="FirstParagraph"/>
-      </w:pPr>
-      <w:r>
-        <w:t xml:space="preserve">where the response variable</w:t>
+        <w:t xml:space="preserve">We used the same coefficient prior and covariance structure as for the point-estimate model (Eqs. (9) and (10)), where the response variable</w:t>
       </w:r>
       <w:r>
         <w:t xml:space="preserve"> </w:t>
@@ -6417,7 +6154,7 @@
             <m:t>(</m:t>
           </m:r>
           <m:r>
-            <m:t>15</m:t>
+            <m:t>13</m:t>
           </m:r>
           <m:r>
             <m:rPr>
@@ -6537,7 +6274,7 @@
         <w:pStyle w:val="BodyText"/>
       </w:pPr>
       <w:r>
-        <w:t xml:space="preserve">For each simulated dataset, we fit three models to estimate the climate effect on recruitment: (i) a Gaussian regression on annual point estimates of fecundity, (ii) a Poisson count model using observed seedling counts and an offset for the number of reproductive individuals, and (iii) a Poisson uncertainty-aware model that additionally included a latent year-specific process term analogous to</w:t>
+        <w:t xml:space="preserve">For each simulated dataset, we fit three models to estimate the climate effect on recruitment: (i) a Gaussian regression with a log link on annual point estimates of fecundity, (ii) a Poisson count model using observed seedling counts and an offset for the number of reproductive individuals, and (iii) a Poisson uncertainty-aware model that additionally included a latent year-specific process term analogous to</w:t>
       </w:r>
       <w:r>
         <w:t xml:space="preserve"> </w:t>
@@ -6557,7 +6294,7 @@
         </m:sSub>
       </m:oMath>
       <w:r>
-        <w:t xml:space="preserve">. We then compared the models in terms of bias and 95% interval coverage (the proportion of replicate datasets in which the 95% interval contained the true effect</w:t>
+        <w:t xml:space="preserve">. All three models target the same log-scale climate effect; the Gaussian model uses untransformed rates as its response and assumes constant residual variance. Its 95% intervals use the coefficient estimate ± a Student-t critical value times its standard error, with residual degrees of freedom. We then compared the models in terms of bias and 95% interval coverage (the proportion of replicate datasets in which the 95% interval contained the true effect</w:t>
       </w:r>
       <w:r>
         <w:t xml:space="preserve"> </w:t>
@@ -6581,7 +6318,7 @@
         </m:sSub>
       </m:oMath>
       <w:r>
-        <w:t xml:space="preserve">; a well-calibrated model achieves coverage close to the nominal 0.95). This design isolates the effect of uncertainty propagation because the true climate effect is known, while still mimicking the sampling structure of finite field data. A supplementary multisite robustness analysis applying the analysis 2 framework to three</w:t>
+        <w:t xml:space="preserve">; a well-calibrated model achieves coverage close to the nominal 0.95). Both Poisson models account for finite-sample count variation; their comparison tests the effect of additionally modelling year-to-year process variation under known truth. A supplementary multisite robustness analysis applying the analysis 2 framework to three</w:t>
       </w:r>
       <w:r>
         <w:t xml:space="preserve"> </w:t>
@@ -6605,6 +6342,14 @@
         <w:pStyle w:val="BodyText"/>
       </w:pPr>
       <w:r>
+        <w:t xml:space="preserve">Priors and fitting settings for the simulation model are given in Supplementary Methods section S1.4.</w:t>
+      </w:r>
+    </w:p>
+    <w:p>
+      <w:pPr>
+        <w:pStyle w:val="BodyText"/>
+      </w:pPr>
+      <w:r>
         <w:t xml:space="preserve">All analyses were run in R (4.6.1) using RStan (2.32.7), with data handling and plotting in tidyverse packages.</w:t>
       </w:r>
     </w:p>
@@ -6634,7 +6379,7 @@
         <w:pStyle w:val="FirstParagraph"/>
       </w:pPr>
       <w:r>
-        <w:t xml:space="preserve">We first summarise the overall contribution of sampling uncertainty to observed trait variation using variance-component ratios (Table</w:t>
+        <w:t xml:space="preserve">We first compare the dispersion of point estimates and posterior means across population-level entries (Table</w:t>
       </w:r>
       <w:r>
         <w:t xml:space="preserve"> </w:t>
@@ -6643,7 +6388,7 @@
         <w:t xml:space="preserve">1</w:t>
       </w:r>
       <w:r>
-        <w:t xml:space="preserve">), then ask whether this variation is large enough to alter inference in a specific comparative analysis.</w:t>
+        <w:t xml:space="preserve">), then ask whether accounting for sampling uncertainty alters inference in a specific comparative analysis.</w:t>
       </w:r>
     </w:p>
     <w:p>
@@ -6651,7 +6396,7 @@
         <w:pStyle w:val="BodyText"/>
       </w:pPr>
       <w:r>
-        <w:t xml:space="preserve">For our parameters of interest, life expectancy and shape, the estimated sampling-to-other variance ratios across population-level MPM entries in analysis 1 were 1.93 and 3.31, respectively (Table</w:t>
+        <w:t xml:space="preserve">For life expectancy and shape, across-entry variance of point estimates was 1.93 and 3.31 times the variance of posterior means, respectively (Table</w:t>
       </w:r>
       <w:r>
         <w:t xml:space="preserve"> </w:t>
@@ -6660,7 +6405,7 @@
         <w:t xml:space="preserve">1</w:t>
       </w:r>
       <w:r>
-        <w:t xml:space="preserve">). Because sample sizes were pooled across years, these ratios are conservative estimates of the true sampling-to-biological variance ratio. Thus, part of the apparent among-population variation in mortality trajectories in comparative senescence analyses may reflect sampling noise and temporal variation, not only true underlying biological differences. Point estimates of life expectancy and shape often deviated from their respective sampling distributions (Fig.</w:t>
+        <w:t xml:space="preserve">). These ratios describe dispersion, not the proportion of variance attributable to sampling uncertainty. Point estimates of life expectancy and shape often deviated from their respective sampling distributions (Fig.</w:t>
       </w:r>
       <w:r>
         <w:t xml:space="preserve"> </w:t>
@@ -6686,7 +6431,7 @@
         <w:t xml:space="preserve">4</w:t>
       </w:r>
       <w:r>
-        <w:t xml:space="preserve">; Supplementary Table S3). While the posterior distribution of the slope parameter β from the point-estimate model was centred slightly to the left of zero (P[β &gt; 0] = 0.146), the corresponding posterior from the sampling-uncertainty model was shifted somewhat to the right (P[β &gt; 0] = 0.770). This shift in the posterior between the two models led to a change in sign of the posterior median between the two scenarios. The shift in sign of the result is not trivial; however, given that the overall conclusion in both cases is that there is no strong effect, this remains robust.</w:t>
+        <w:t xml:space="preserve">; Supplementary Table S3). While the posterior distribution of the slope parameter β from the point-estimate model was centred slightly to the left of zero (P[β &gt; 0] = 0.206), the corresponding posterior from the sampling-uncertainty model was shifted somewhat to the right (P[β &gt; 0] = 0.770). The posterior median of the slope therefore changed sign between the two models. This shift is not trivial, but because both posteriors span zero the overall conclusion, that there is no strong effect, is unchanged.</w:t>
       </w:r>
     </w:p>
     <w:p>
@@ -6780,7 +6525,7 @@
         <w:pStyle w:val="FirstParagraph"/>
       </w:pPr>
       <w:r>
-        <w:t xml:space="preserve">The simulation study showed that accounting for sampling uncertainty improved interval calibration without materially increasing average estimation error (Fig.</w:t>
+        <w:t xml:space="preserve">The simulation study showed that accounting for year-to-year process variation improved interval calibration without materially increasing average estimation error (Fig.</w:t>
       </w:r>
       <w:r>
         <w:t xml:space="preserve"> </w:t>
@@ -6789,7 +6534,7 @@
         <w:t xml:space="preserve">6</w:t>
       </w:r>
       <w:r>
-        <w:t xml:space="preserve">). Across the full factorial design, the uncertainty-aware Poisson model achieved near-nominal 95% interval coverage (0.951), whereas the simpler Poisson point-estimate model undercovered substantially (0.757). The two Poisson formulations had very similar overall RMSE (0.086 versus 0.087), indicating that the main benefit of explicit uncertainty propagation was improved interval calibration rather than reduced average error.</w:t>
+        <w:t xml:space="preserve">). Across the full factorial design, the uncertainty-aware Poisson model achieved near-nominal 95% interval coverage (0.951), whereas the simpler Poisson point-estimate model undercovered substantially (0.757). The two Poisson formulations had very similar overall RMSE (0.086 versus 0.087), indicating that the main benefit of modelling this process variation was improved interval calibration rather than reduced average error.</w:t>
       </w:r>
     </w:p>
     <w:p>
@@ -6814,7 +6559,16 @@
         <w:pStyle w:val="BodyText"/>
       </w:pPr>
       <w:r>
-        <w:t xml:space="preserve">Bias patterns also differed among models. The Gaussian point-estimate model showed increasing positive bias as the true effect size increased, with mean bias reaching 0.066 when</w:t>
+        <w:t xml:space="preserve">All three models showed little average bias (Fig.</w:t>
+      </w:r>
+      <w:r>
+        <w:t xml:space="preserve"> </w:t>
+      </w:r>
+      <w:r>
+        <w:t xml:space="preserve">6</w:t>
+      </w:r>
+      <w:r>
+        <w:t xml:space="preserve">). For the Gaussian log-link model, mean bias was -0.005 when</w:t>
       </w:r>
       <w:r>
         <w:t xml:space="preserve"> </w:t>
@@ -6847,16 +6601,7 @@
         </m:r>
       </m:oMath>
       <w:r>
-        <w:t xml:space="preserve">, whereas both Poisson models remained close to unbiased throughout the design (Fig.</w:t>
-      </w:r>
-      <w:r>
-        <w:t xml:space="preserve"> </w:t>
-      </w:r>
-      <w:r>
-        <w:t xml:space="preserve">6</w:t>
-      </w:r>
-      <w:r>
-        <w:t xml:space="preserve">). The uncertainty-aware model therefore combines the low bias of the count-based formulation with interval coverage close to the nominal 95% level. A supplementary multisite robustness analysis based on three</w:t>
+        <w:t xml:space="preserve">, but its overall 95% interval coverage was 0.915, below the nominal level. The uncertainty-aware model therefore combines the low bias of the count-based formulation with interval coverage close to the nominal 95% level. A supplementary multisite robustness analysis based on three</w:t>
       </w:r>
       <w:r>
         <w:t xml:space="preserve"> </w:t>
@@ -6916,7 +6661,25 @@
         <w:pStyle w:val="BodyText"/>
       </w:pPr>
       <w:r>
-        <w:t xml:space="preserve">For several commonly used integrated demographic metrics, such as population growth rate (λ), generation time, and individual growth rate, sampling uncertainty accounted for only a small fraction of the total variation observed among populations. By contrast, traits related to mortality trajectories, particularly the shape of the mortality distribution, were far more sensitive: nearly half of the total variation in shape was attributable to sampling uncertainty. In these cases, much of the apparent variation among published MPMs is not distinguishable from statistical noise. This result helps explain why incorporating sampling uncertainty shifted inference in the senescence analysis but had little effect in the climate-recruitment analysis, where the response variable was more directly linked to observed counts and less dependent on long-term survivorship.</w:t>
+        <w:t xml:space="preserve">Point estimates were far more dispersed relative to their posterior means for mortality-trajectory traits, particularly shape, than for integrated metrics such as population growth rate (λ) and generation time (Table</w:t>
+      </w:r>
+      <w:r>
+        <w:t xml:space="preserve"> </w:t>
+      </w:r>
+      <w:r>
+        <w:t xml:space="preserve">1</w:t>
+      </w:r>
+      <w:r>
+        <w:t xml:space="preserve">). This greater dispersion, together with the displacements shown in Figure</w:t>
+      </w:r>
+      <w:r>
+        <w:t xml:space="preserve"> </w:t>
+      </w:r>
+      <w:r>
+        <w:t xml:space="preserve">3</w:t>
+      </w:r>
+      <w:r>
+        <w:t xml:space="preserve">, indicates that mortality-trajectory traits are more sensitive to sampling uncertainty than the directly observed recruitment response in the climate analysis.</w:t>
       </w:r>
     </w:p>
     <w:bookmarkEnd w:id="37"/>
@@ -6934,7 +6697,7 @@
         <w:pStyle w:val="FirstParagraph"/>
       </w:pPr>
       <w:r>
-        <w:t xml:space="preserve">A plausible contributor to the sensitivity of mortality-trajectory traits is that life expectancy and shape are inferred via age-from-stage methods, which project a cohort forward through repeated matrix multiplication. Repeated projection can amplify transition-rate uncertainty into uncertainty in long-term survivorship. Integrated metrics such as population growth rate were less sensitive in our analyses, but are not inherently protected from sampling uncertainty.</w:t>
+        <w:t xml:space="preserve">The sensitivity of mortality-trajectory traits has a clear mechanistic basis. Life expectancy and shape are inferred via age-from-stage methods, which project a cohort forward through repeated matrix multiplication, so errors in late-stage survival are not simply carried forward but compounded across projection steps, amplifying small transition-rate uncertainties into large uncertainties in long-term survivorship. Integrated metrics such as population growth rate are buffered against this, because they average over many transitions where errors tend to partially cancel, although they are not wholly immune to sampling uncertainty.</w:t>
       </w:r>
     </w:p>
     <w:p>
@@ -6982,7 +6745,7 @@
         <w:pStyle w:val="FirstParagraph"/>
       </w:pPr>
       <w:r>
-        <w:t xml:space="preserve">These structural constraints have practical implications. Highly aggregated demographic metrics, such as population growth rate and generation time, were less sensitive in our dataset, but this does not establish that uncertainty modelling is unnecessary. Analyses of ageing, longevity, or mortality trajectories appeared more sensitive and warrant particular caution.</w:t>
+        <w:t xml:space="preserve">These structural constraints have practical implications. Highly aggregated demographic metrics, such as population growth rate and generation time, were among the least sensitive in our dataset, so analyses focused on them will often be robust to sampling uncertainty, although this should be checked rather than assumed. Analyses of ageing, longevity, or mortality trajectories were more sensitive and warrant particular caution.</w:t>
       </w:r>
     </w:p>
     <w:p>
@@ -7088,7 +6851,7 @@
         <w:pStyle w:val="FirstParagraph"/>
       </w:pPr>
       <w:r>
-        <w:t xml:space="preserve">Our analyses show that the consequences of transition-rate sampling uncertainty in published matrix population models are highly trait-dependent. For many commonly used integrated demographic metrics, such as population growth rate and generation time, sampling uncertainty accounted for only a small fraction of total variation, suggesting lower sensitivity for these traits in this dataset, rather than general robustness across published MPMs. By contrast, parameters related to mortality trajectories, including life expectancy and, especially, the shape of the mortality distribution, were substantially more sensitive to sampling uncertainty. In these cases, a large proportion of apparent variation among published matrices is indistinguishable from statistical noise, and point estimates can be systematically biased by boundary estimates of stage-specific survival.</w:t>
+        <w:t xml:space="preserve">Our analyses show that the consequences of transition-rate sampling uncertainty in published matrix population models are highly trait-dependent. For integrated metrics such as population growth rate and generation time, point estimates were only modestly more dispersed than their posterior means, whereas for mortality-trajectory traits, including life expectancy and especially the shape of the mortality distribution, they were much more dispersed and more sensitive to sampling uncertainty. In these cases, point estimates can be displaced from the centres of their posterior distributions by boundary estimates of stage-specific survival.</w:t>
       </w:r>
     </w:p>
     <w:p>
@@ -7304,7 +7067,7 @@
         <w:t xml:space="preserve">Supplementary Methods S1.5</w:t>
       </w:r>
       <w:r>
-        <w:t xml:space="preserve">: Variance-component summary (sampling-to-other ratio).</w:t>
+        <w:t xml:space="preserve">: Comparison of point-estimate and posterior-mean variance.</w:t>
       </w:r>
     </w:p>
     <w:p>
@@ -9274,7 +9037,7 @@
         <w:t xml:space="preserve"> </w:t>
       </w:r>
       <w:r>
-        <w:t xml:space="preserve">Sampling-to-other variance ratios for key demographic parameters in analysis 1, with 95% intervals from the variance-component model. Ratios greater than 1 indicate that variance attributable to transition-rate sampling uncertainty exceeds residual biological variance across population-level entries (including both among-population and among-species variation). This shows that the ratio is highest for shape, intermediate for life expectancy, and lowest for log population growth rate.</w:t>
+        <w:t xml:space="preserve">Across-entry variance ratios for key demographic parameters in analysis 1, with 95% intervals from paired bootstrap resampling of population-level entries. Each ratio is the variance of matrix point estimates divided by the variance of reconstructed posterior means across the same entries; values above 1 indicate greater dispersion of point estimates, not a fraction of variance attributable to sampling. The ratio is highest for shape, intermediate for life expectancy, and lowest for log population growth rate.</w:t>
       </w:r>
     </w:p>
     <w:tbl xmlns:w="http://schemas.openxmlformats.org/wordprocessingml/2006/main" xmlns:r="http://schemas.openxmlformats.org/officeDocument/2006/relationships" xmlns:w14="http://schemas.microsoft.com/office/word/2010/wordml" xmlns:wp="http://schemas.openxmlformats.org/drawingml/2006/wordprocessingDrawing" xmlns:a="http://schemas.openxmlformats.org/drawingml/2006/main" xmlns:pic="http://schemas.openxmlformats.org/drawingml/2006/picture">
@@ -9285,14 +9048,12 @@
       </w:tblPr>
       <w:tblGrid>
         <w:gridCol w:w="3431"/>
-        <w:gridCol w:w="3272"/>
-        <w:gridCol w:w="985"/>
-        <w:gridCol w:w="1022"/>
+        <w:gridCol w:w="1768"/>
         <w:gridCol w:w="1621"/>
       </w:tblGrid>
       <w:tr>
         <w:trPr>
-          <w:trHeight w:val="621" w:hRule="auto"/>
+          <w:trHeight w:val="573" w:hRule="auto"/>
           <w:tblHeader/>
         </w:trPr>
         <w:tc>
@@ -9399,115 +9160,7 @@
                 <w:szCs w:val="22"/>
                 <w:color w:val="000000"/>
               </w:rPr>
-              <w:t xml:space="preserve">Sampling:other variance ratio</w:t>
-            </w:r>
-          </w:p>
-        </w:tc>
-        <w:tc>
-          <w:tcPr>
-            <w:tcBorders>
-              <w:bottom w:val="single" w:sz="12" w:space="0" w:color="666666"/>
-              <w:top w:val="single" w:sz="12" w:space="0" w:color="666666"/>
-              <w:left w:val="none" w:sz="0" w:space="0" w:color="000000"/>
-              <w:right w:val="none" w:sz="0" w:space="0" w:color="000000"/>
-            </w:tcBorders>
-            <w:shd w:val="clear" w:color="auto" w:fill="FFFFFF"/>
-            <w:tcMar>
-              <w:top w:w="0" w:type="dxa"/>
-              <w:bottom w:w="0" w:type="dxa"/>
-              <w:left w:w="0" w:type="dxa"/>
-              <w:right w:w="0" w:type="dxa"/>
-            </w:tcMar>
-            <w:vAlign w:val="center"/>
-          </w:tcPr>
-          <w:p>
-            <w:pPr>
-              <w:jc w:val="left"/>
-              <w:pBdr>
-                <w:bottom w:val="none" w:sz="0" w:space="0" w:color="000000"/>
-                <w:top w:val="none" w:sz="0" w:space="0" w:color="000000"/>
-                <w:left w:val="none" w:sz="0" w:space="0" w:color="000000"/>
-                <w:right w:val="none" w:sz="0" w:space="0" w:color="000000"/>
-              </w:pBdr>
-              <w:spacing w:after="100" w:before="100" w:line="240"/>
-              <w:ind w:left="100" w:right="100" w:firstLine="0" w:firstLineChars="0"/>
-              <w:rPr>
-                <w:rFonts w:ascii="Helvetica" w:hAnsi="Helvetica" w:eastAsia="Helvetica" w:cs="Helvetica"/>
-                <w:i w:val="false"/>
-                <w:b w:val="false"/>
-                <w:u w:val="none"/>
-                <w:strike w:val="false"/>
-                <w:sz w:val="22"/>
-                <w:szCs w:val="22"/>
-                <w:color w:val="000000"/>
-              </w:rPr>
-            </w:pPr>
-            <w:r xmlns:w="http://schemas.openxmlformats.org/wordprocessingml/2006/main" xmlns:wp="http://schemas.openxmlformats.org/drawingml/2006/wordprocessingDrawing" xmlns:r="http://schemas.openxmlformats.org/officeDocument/2006/relationships" xmlns:w14="http://schemas.microsoft.com/office/word/2010/wordml">
-              <w:rPr>
-                <w:rFonts w:ascii="Helvetica" w:hAnsi="Helvetica" w:eastAsia="Helvetica" w:cs="Helvetica"/>
-                <w:i w:val="false"/>
-                <w:b w:val="false"/>
-                <w:u w:val="none"/>
-                <w:strike w:val="false"/>
-                <w:sz w:val="22"/>
-                <w:szCs w:val="22"/>
-                <w:color w:val="000000"/>
-              </w:rPr>
-              <w:t xml:space="preserve">low95</w:t>
-            </w:r>
-          </w:p>
-        </w:tc>
-        <w:tc>
-          <w:tcPr>
-            <w:tcBorders>
-              <w:bottom w:val="single" w:sz="12" w:space="0" w:color="666666"/>
-              <w:top w:val="single" w:sz="12" w:space="0" w:color="666666"/>
-              <w:left w:val="none" w:sz="0" w:space="0" w:color="000000"/>
-              <w:right w:val="none" w:sz="0" w:space="0" w:color="000000"/>
-            </w:tcBorders>
-            <w:shd w:val="clear" w:color="auto" w:fill="FFFFFF"/>
-            <w:tcMar>
-              <w:top w:w="0" w:type="dxa"/>
-              <w:bottom w:w="0" w:type="dxa"/>
-              <w:left w:w="0" w:type="dxa"/>
-              <w:right w:w="0" w:type="dxa"/>
-            </w:tcMar>
-            <w:vAlign w:val="center"/>
-          </w:tcPr>
-          <w:p>
-            <w:pPr>
-              <w:jc w:val="left"/>
-              <w:pBdr>
-                <w:bottom w:val="none" w:sz="0" w:space="0" w:color="000000"/>
-                <w:top w:val="none" w:sz="0" w:space="0" w:color="000000"/>
-                <w:left w:val="none" w:sz="0" w:space="0" w:color="000000"/>
-                <w:right w:val="none" w:sz="0" w:space="0" w:color="000000"/>
-              </w:pBdr>
-              <w:spacing w:after="100" w:before="100" w:line="240"/>
-              <w:ind w:left="100" w:right="100" w:firstLine="0" w:firstLineChars="0"/>
-              <w:rPr>
-                <w:rFonts w:ascii="Helvetica" w:hAnsi="Helvetica" w:eastAsia="Helvetica" w:cs="Helvetica"/>
-                <w:i w:val="false"/>
-                <w:b w:val="false"/>
-                <w:u w:val="none"/>
-                <w:strike w:val="false"/>
-                <w:sz w:val="22"/>
-                <w:szCs w:val="22"/>
-                <w:color w:val="000000"/>
-              </w:rPr>
-            </w:pPr>
-            <w:r xmlns:w="http://schemas.openxmlformats.org/wordprocessingml/2006/main" xmlns:wp="http://schemas.openxmlformats.org/drawingml/2006/wordprocessingDrawing" xmlns:r="http://schemas.openxmlformats.org/officeDocument/2006/relationships" xmlns:w14="http://schemas.microsoft.com/office/word/2010/wordml">
-              <w:rPr>
-                <w:rFonts w:ascii="Helvetica" w:hAnsi="Helvetica" w:eastAsia="Helvetica" w:cs="Helvetica"/>
-                <w:i w:val="false"/>
-                <w:b w:val="false"/>
-                <w:u w:val="none"/>
-                <w:strike w:val="false"/>
-                <w:sz w:val="22"/>
-                <w:szCs w:val="22"/>
-                <w:color w:val="000000"/>
-              </w:rPr>
-              <w:t xml:space="preserve">upp95</w:t>
+              <w:t xml:space="preserve">Variance ratio</w:t>
             </w:r>
           </w:p>
         </w:tc>
@@ -9728,114 +9381,6 @@
                 <w:szCs w:val="22"/>
                 <w:color w:val="000000"/>
               </w:rPr>
-              <w:t xml:space="preserve">2.26</w:t>
-            </w:r>
-          </w:p>
-        </w:tc>
-        <w:tc>
-          <w:tcPr>
-            <w:tcBorders>
-              <w:bottom w:val="none" w:sz="0" w:space="0" w:color="000000"/>
-              <w:top w:val="single" w:sz="12" w:space="0" w:color="666666"/>
-              <w:left w:val="none" w:sz="0" w:space="0" w:color="000000"/>
-              <w:right w:val="none" w:sz="0" w:space="0" w:color="000000"/>
-            </w:tcBorders>
-            <w:shd w:val="clear" w:color="auto" w:fill="FFFFFF"/>
-            <w:tcMar>
-              <w:top w:w="0" w:type="dxa"/>
-              <w:bottom w:w="0" w:type="dxa"/>
-              <w:left w:w="0" w:type="dxa"/>
-              <w:right w:w="0" w:type="dxa"/>
-            </w:tcMar>
-            <w:vAlign w:val="center"/>
-          </w:tcPr>
-          <w:p>
-            <w:pPr>
-              <w:jc w:val="left"/>
-              <w:pBdr>
-                <w:bottom w:val="none" w:sz="0" w:space="0" w:color="000000"/>
-                <w:top w:val="none" w:sz="0" w:space="0" w:color="000000"/>
-                <w:left w:val="none" w:sz="0" w:space="0" w:color="000000"/>
-                <w:right w:val="none" w:sz="0" w:space="0" w:color="000000"/>
-              </w:pBdr>
-              <w:spacing w:after="100" w:before="100" w:line="240"/>
-              <w:ind w:left="100" w:right="100" w:firstLine="0" w:firstLineChars="0"/>
-              <w:rPr>
-                <w:rFonts w:ascii="Helvetica" w:hAnsi="Helvetica" w:eastAsia="Helvetica" w:cs="Helvetica"/>
-                <w:i w:val="false"/>
-                <w:b w:val="false"/>
-                <w:u w:val="none"/>
-                <w:strike w:val="false"/>
-                <w:sz w:val="22"/>
-                <w:szCs w:val="22"/>
-                <w:color w:val="000000"/>
-              </w:rPr>
-            </w:pPr>
-            <w:r xmlns:w="http://schemas.openxmlformats.org/wordprocessingml/2006/main" xmlns:wp="http://schemas.openxmlformats.org/drawingml/2006/wordprocessingDrawing" xmlns:r="http://schemas.openxmlformats.org/officeDocument/2006/relationships" xmlns:w14="http://schemas.microsoft.com/office/word/2010/wordml">
-              <w:rPr>
-                <w:rFonts w:ascii="Helvetica" w:hAnsi="Helvetica" w:eastAsia="Helvetica" w:cs="Helvetica"/>
-                <w:i w:val="false"/>
-                <w:b w:val="false"/>
-                <w:u w:val="none"/>
-                <w:strike w:val="false"/>
-                <w:sz w:val="22"/>
-                <w:szCs w:val="22"/>
-                <w:color w:val="000000"/>
-              </w:rPr>
-              <w:t xml:space="preserve">5.06</w:t>
-            </w:r>
-          </w:p>
-        </w:tc>
-        <w:tc>
-          <w:tcPr>
-            <w:tcBorders>
-              <w:bottom w:val="none" w:sz="0" w:space="0" w:color="000000"/>
-              <w:top w:val="single" w:sz="12" w:space="0" w:color="666666"/>
-              <w:left w:val="none" w:sz="0" w:space="0" w:color="000000"/>
-              <w:right w:val="none" w:sz="0" w:space="0" w:color="000000"/>
-            </w:tcBorders>
-            <w:shd w:val="clear" w:color="auto" w:fill="FFFFFF"/>
-            <w:tcMar>
-              <w:top w:w="0" w:type="dxa"/>
-              <w:bottom w:w="0" w:type="dxa"/>
-              <w:left w:w="0" w:type="dxa"/>
-              <w:right w:w="0" w:type="dxa"/>
-            </w:tcMar>
-            <w:vAlign w:val="center"/>
-          </w:tcPr>
-          <w:p>
-            <w:pPr>
-              <w:jc w:val="left"/>
-              <w:pBdr>
-                <w:bottom w:val="none" w:sz="0" w:space="0" w:color="000000"/>
-                <w:top w:val="none" w:sz="0" w:space="0" w:color="000000"/>
-                <w:left w:val="none" w:sz="0" w:space="0" w:color="000000"/>
-                <w:right w:val="none" w:sz="0" w:space="0" w:color="000000"/>
-              </w:pBdr>
-              <w:spacing w:after="100" w:before="100" w:line="240"/>
-              <w:ind w:left="100" w:right="100" w:firstLine="0" w:firstLineChars="0"/>
-              <w:rPr>
-                <w:rFonts w:ascii="Helvetica" w:hAnsi="Helvetica" w:eastAsia="Helvetica" w:cs="Helvetica"/>
-                <w:i w:val="false"/>
-                <w:b w:val="false"/>
-                <w:u w:val="none"/>
-                <w:strike w:val="false"/>
-                <w:sz w:val="22"/>
-                <w:szCs w:val="22"/>
-                <w:color w:val="000000"/>
-              </w:rPr>
-            </w:pPr>
-            <w:r xmlns:w="http://schemas.openxmlformats.org/wordprocessingml/2006/main" xmlns:wp="http://schemas.openxmlformats.org/drawingml/2006/wordprocessingDrawing" xmlns:r="http://schemas.openxmlformats.org/officeDocument/2006/relationships" xmlns:w14="http://schemas.microsoft.com/office/word/2010/wordml">
-              <w:rPr>
-                <w:rFonts w:ascii="Helvetica" w:hAnsi="Helvetica" w:eastAsia="Helvetica" w:cs="Helvetica"/>
-                <w:i w:val="false"/>
-                <w:b w:val="false"/>
-                <w:u w:val="none"/>
-                <w:strike w:val="false"/>
-                <w:sz w:val="22"/>
-                <w:szCs w:val="22"/>
-                <w:color w:val="000000"/>
-              </w:rPr>
               <w:t xml:space="preserve">[2.26, 5.06]</w:t>
             </w:r>
           </w:p>
@@ -9950,114 +9495,6 @@
                 <w:color w:val="000000"/>
               </w:rPr>
               <w:t xml:space="preserve">1.93</w:t>
-            </w:r>
-          </w:p>
-        </w:tc>
-        <w:tc>
-          <w:tcPr>
-            <w:tcBorders>
-              <w:bottom w:val="none" w:sz="0" w:space="0" w:color="000000"/>
-              <w:top w:val="none" w:sz="0" w:space="0" w:color="000000"/>
-              <w:left w:val="none" w:sz="0" w:space="0" w:color="000000"/>
-              <w:right w:val="none" w:sz="0" w:space="0" w:color="000000"/>
-            </w:tcBorders>
-            <w:shd w:val="clear" w:color="auto" w:fill="FFFFFF"/>
-            <w:tcMar>
-              <w:top w:w="0" w:type="dxa"/>
-              <w:bottom w:w="0" w:type="dxa"/>
-              <w:left w:w="0" w:type="dxa"/>
-              <w:right w:w="0" w:type="dxa"/>
-            </w:tcMar>
-            <w:vAlign w:val="center"/>
-          </w:tcPr>
-          <w:p>
-            <w:pPr>
-              <w:jc w:val="left"/>
-              <w:pBdr>
-                <w:bottom w:val="none" w:sz="0" w:space="0" w:color="000000"/>
-                <w:top w:val="none" w:sz="0" w:space="0" w:color="000000"/>
-                <w:left w:val="none" w:sz="0" w:space="0" w:color="000000"/>
-                <w:right w:val="none" w:sz="0" w:space="0" w:color="000000"/>
-              </w:pBdr>
-              <w:spacing w:after="100" w:before="100" w:line="240"/>
-              <w:ind w:left="100" w:right="100" w:firstLine="0" w:firstLineChars="0"/>
-              <w:rPr>
-                <w:rFonts w:ascii="Helvetica" w:hAnsi="Helvetica" w:eastAsia="Helvetica" w:cs="Helvetica"/>
-                <w:i w:val="false"/>
-                <w:b w:val="false"/>
-                <w:u w:val="none"/>
-                <w:strike w:val="false"/>
-                <w:sz w:val="22"/>
-                <w:szCs w:val="22"/>
-                <w:color w:val="000000"/>
-              </w:rPr>
-            </w:pPr>
-            <w:r xmlns:w="http://schemas.openxmlformats.org/wordprocessingml/2006/main" xmlns:wp="http://schemas.openxmlformats.org/drawingml/2006/wordprocessingDrawing" xmlns:r="http://schemas.openxmlformats.org/officeDocument/2006/relationships" xmlns:w14="http://schemas.microsoft.com/office/word/2010/wordml">
-              <w:rPr>
-                <w:rFonts w:ascii="Helvetica" w:hAnsi="Helvetica" w:eastAsia="Helvetica" w:cs="Helvetica"/>
-                <w:i w:val="false"/>
-                <w:b w:val="false"/>
-                <w:u w:val="none"/>
-                <w:strike w:val="false"/>
-                <w:sz w:val="22"/>
-                <w:szCs w:val="22"/>
-                <w:color w:val="000000"/>
-              </w:rPr>
-              <w:t xml:space="preserve">1.48</w:t>
-            </w:r>
-          </w:p>
-        </w:tc>
-        <w:tc>
-          <w:tcPr>
-            <w:tcBorders>
-              <w:bottom w:val="none" w:sz="0" w:space="0" w:color="000000"/>
-              <w:top w:val="none" w:sz="0" w:space="0" w:color="000000"/>
-              <w:left w:val="none" w:sz="0" w:space="0" w:color="000000"/>
-              <w:right w:val="none" w:sz="0" w:space="0" w:color="000000"/>
-            </w:tcBorders>
-            <w:shd w:val="clear" w:color="auto" w:fill="FFFFFF"/>
-            <w:tcMar>
-              <w:top w:w="0" w:type="dxa"/>
-              <w:bottom w:w="0" w:type="dxa"/>
-              <w:left w:w="0" w:type="dxa"/>
-              <w:right w:w="0" w:type="dxa"/>
-            </w:tcMar>
-            <w:vAlign w:val="center"/>
-          </w:tcPr>
-          <w:p>
-            <w:pPr>
-              <w:jc w:val="left"/>
-              <w:pBdr>
-                <w:bottom w:val="none" w:sz="0" w:space="0" w:color="000000"/>
-                <w:top w:val="none" w:sz="0" w:space="0" w:color="000000"/>
-                <w:left w:val="none" w:sz="0" w:space="0" w:color="000000"/>
-                <w:right w:val="none" w:sz="0" w:space="0" w:color="000000"/>
-              </w:pBdr>
-              <w:spacing w:after="100" w:before="100" w:line="240"/>
-              <w:ind w:left="100" w:right="100" w:firstLine="0" w:firstLineChars="0"/>
-              <w:rPr>
-                <w:rFonts w:ascii="Helvetica" w:hAnsi="Helvetica" w:eastAsia="Helvetica" w:cs="Helvetica"/>
-                <w:i w:val="false"/>
-                <w:b w:val="false"/>
-                <w:u w:val="none"/>
-                <w:strike w:val="false"/>
-                <w:sz w:val="22"/>
-                <w:szCs w:val="22"/>
-                <w:color w:val="000000"/>
-              </w:rPr>
-            </w:pPr>
-            <w:r xmlns:w="http://schemas.openxmlformats.org/wordprocessingml/2006/main" xmlns:wp="http://schemas.openxmlformats.org/drawingml/2006/wordprocessingDrawing" xmlns:r="http://schemas.openxmlformats.org/officeDocument/2006/relationships" xmlns:w14="http://schemas.microsoft.com/office/word/2010/wordml">
-              <w:rPr>
-                <w:rFonts w:ascii="Helvetica" w:hAnsi="Helvetica" w:eastAsia="Helvetica" w:cs="Helvetica"/>
-                <w:i w:val="false"/>
-                <w:b w:val="false"/>
-                <w:u w:val="none"/>
-                <w:strike w:val="false"/>
-                <w:sz w:val="22"/>
-                <w:szCs w:val="22"/>
-                <w:color w:val="000000"/>
-              </w:rPr>
-              <w:t xml:space="preserve">2.55</w:t>
             </w:r>
           </w:p>
         </w:tc>
@@ -10278,114 +9715,6 @@
                 <w:szCs w:val="22"/>
                 <w:color w:val="000000"/>
               </w:rPr>
-              <w:t xml:space="preserve">0.99</w:t>
-            </w:r>
-          </w:p>
-        </w:tc>
-        <w:tc>
-          <w:tcPr>
-            <w:tcBorders>
-              <w:bottom w:val="none" w:sz="0" w:space="0" w:color="000000"/>
-              <w:top w:val="none" w:sz="0" w:space="0" w:color="000000"/>
-              <w:left w:val="none" w:sz="0" w:space="0" w:color="000000"/>
-              <w:right w:val="none" w:sz="0" w:space="0" w:color="000000"/>
-            </w:tcBorders>
-            <w:shd w:val="clear" w:color="auto" w:fill="FFFFFF"/>
-            <w:tcMar>
-              <w:top w:w="0" w:type="dxa"/>
-              <w:bottom w:w="0" w:type="dxa"/>
-              <w:left w:w="0" w:type="dxa"/>
-              <w:right w:w="0" w:type="dxa"/>
-            </w:tcMar>
-            <w:vAlign w:val="center"/>
-          </w:tcPr>
-          <w:p>
-            <w:pPr>
-              <w:jc w:val="left"/>
-              <w:pBdr>
-                <w:bottom w:val="none" w:sz="0" w:space="0" w:color="000000"/>
-                <w:top w:val="none" w:sz="0" w:space="0" w:color="000000"/>
-                <w:left w:val="none" w:sz="0" w:space="0" w:color="000000"/>
-                <w:right w:val="none" w:sz="0" w:space="0" w:color="000000"/>
-              </w:pBdr>
-              <w:spacing w:after="100" w:before="100" w:line="240"/>
-              <w:ind w:left="100" w:right="100" w:firstLine="0" w:firstLineChars="0"/>
-              <w:rPr>
-                <w:rFonts w:ascii="Helvetica" w:hAnsi="Helvetica" w:eastAsia="Helvetica" w:cs="Helvetica"/>
-                <w:i w:val="false"/>
-                <w:b w:val="false"/>
-                <w:u w:val="none"/>
-                <w:strike w:val="false"/>
-                <w:sz w:val="22"/>
-                <w:szCs w:val="22"/>
-                <w:color w:val="000000"/>
-              </w:rPr>
-            </w:pPr>
-            <w:r xmlns:w="http://schemas.openxmlformats.org/wordprocessingml/2006/main" xmlns:wp="http://schemas.openxmlformats.org/drawingml/2006/wordprocessingDrawing" xmlns:r="http://schemas.openxmlformats.org/officeDocument/2006/relationships" xmlns:w14="http://schemas.microsoft.com/office/word/2010/wordml">
-              <w:rPr>
-                <w:rFonts w:ascii="Helvetica" w:hAnsi="Helvetica" w:eastAsia="Helvetica" w:cs="Helvetica"/>
-                <w:i w:val="false"/>
-                <w:b w:val="false"/>
-                <w:u w:val="none"/>
-                <w:strike w:val="false"/>
-                <w:sz w:val="22"/>
-                <w:szCs w:val="22"/>
-                <w:color w:val="000000"/>
-              </w:rPr>
-              <w:t xml:space="preserve">1.15</w:t>
-            </w:r>
-          </w:p>
-        </w:tc>
-        <w:tc>
-          <w:tcPr>
-            <w:tcBorders>
-              <w:bottom w:val="none" w:sz="0" w:space="0" w:color="000000"/>
-              <w:top w:val="none" w:sz="0" w:space="0" w:color="000000"/>
-              <w:left w:val="none" w:sz="0" w:space="0" w:color="000000"/>
-              <w:right w:val="none" w:sz="0" w:space="0" w:color="000000"/>
-            </w:tcBorders>
-            <w:shd w:val="clear" w:color="auto" w:fill="FFFFFF"/>
-            <w:tcMar>
-              <w:top w:w="0" w:type="dxa"/>
-              <w:bottom w:w="0" w:type="dxa"/>
-              <w:left w:w="0" w:type="dxa"/>
-              <w:right w:w="0" w:type="dxa"/>
-            </w:tcMar>
-            <w:vAlign w:val="center"/>
-          </w:tcPr>
-          <w:p>
-            <w:pPr>
-              <w:jc w:val="left"/>
-              <w:pBdr>
-                <w:bottom w:val="none" w:sz="0" w:space="0" w:color="000000"/>
-                <w:top w:val="none" w:sz="0" w:space="0" w:color="000000"/>
-                <w:left w:val="none" w:sz="0" w:space="0" w:color="000000"/>
-                <w:right w:val="none" w:sz="0" w:space="0" w:color="000000"/>
-              </w:pBdr>
-              <w:spacing w:after="100" w:before="100" w:line="240"/>
-              <w:ind w:left="100" w:right="100" w:firstLine="0" w:firstLineChars="0"/>
-              <w:rPr>
-                <w:rFonts w:ascii="Helvetica" w:hAnsi="Helvetica" w:eastAsia="Helvetica" w:cs="Helvetica"/>
-                <w:i w:val="false"/>
-                <w:b w:val="false"/>
-                <w:u w:val="none"/>
-                <w:strike w:val="false"/>
-                <w:sz w:val="22"/>
-                <w:szCs w:val="22"/>
-                <w:color w:val="000000"/>
-              </w:rPr>
-            </w:pPr>
-            <w:r xmlns:w="http://schemas.openxmlformats.org/wordprocessingml/2006/main" xmlns:wp="http://schemas.openxmlformats.org/drawingml/2006/wordprocessingDrawing" xmlns:r="http://schemas.openxmlformats.org/officeDocument/2006/relationships" xmlns:w14="http://schemas.microsoft.com/office/word/2010/wordml">
-              <w:rPr>
-                <w:rFonts w:ascii="Helvetica" w:hAnsi="Helvetica" w:eastAsia="Helvetica" w:cs="Helvetica"/>
-                <w:i w:val="false"/>
-                <w:b w:val="false"/>
-                <w:u w:val="none"/>
-                <w:strike w:val="false"/>
-                <w:sz w:val="22"/>
-                <w:szCs w:val="22"/>
-                <w:color w:val="000000"/>
-              </w:rPr>
               <w:t xml:space="preserve">[0.99, 1.15]</w:t>
             </w:r>
           </w:p>
@@ -10500,114 +9829,6 @@
                 <w:color w:val="000000"/>
               </w:rPr>
               <w:t xml:space="preserve">1.12</w:t>
-            </w:r>
-          </w:p>
-        </w:tc>
-        <w:tc>
-          <w:tcPr>
-            <w:tcBorders>
-              <w:bottom w:val="none" w:sz="0" w:space="0" w:color="000000"/>
-              <w:top w:val="none" w:sz="0" w:space="0" w:color="000000"/>
-              <w:left w:val="none" w:sz="0" w:space="0" w:color="000000"/>
-              <w:right w:val="none" w:sz="0" w:space="0" w:color="000000"/>
-            </w:tcBorders>
-            <w:shd w:val="clear" w:color="auto" w:fill="FFFFFF"/>
-            <w:tcMar>
-              <w:top w:w="0" w:type="dxa"/>
-              <w:bottom w:w="0" w:type="dxa"/>
-              <w:left w:w="0" w:type="dxa"/>
-              <w:right w:w="0" w:type="dxa"/>
-            </w:tcMar>
-            <w:vAlign w:val="center"/>
-          </w:tcPr>
-          <w:p>
-            <w:pPr>
-              <w:jc w:val="left"/>
-              <w:pBdr>
-                <w:bottom w:val="none" w:sz="0" w:space="0" w:color="000000"/>
-                <w:top w:val="none" w:sz="0" w:space="0" w:color="000000"/>
-                <w:left w:val="none" w:sz="0" w:space="0" w:color="000000"/>
-                <w:right w:val="none" w:sz="0" w:space="0" w:color="000000"/>
-              </w:pBdr>
-              <w:spacing w:after="100" w:before="100" w:line="240"/>
-              <w:ind w:left="100" w:right="100" w:firstLine="0" w:firstLineChars="0"/>
-              <w:rPr>
-                <w:rFonts w:ascii="Helvetica" w:hAnsi="Helvetica" w:eastAsia="Helvetica" w:cs="Helvetica"/>
-                <w:i w:val="false"/>
-                <w:b w:val="false"/>
-                <w:u w:val="none"/>
-                <w:strike w:val="false"/>
-                <w:sz w:val="22"/>
-                <w:szCs w:val="22"/>
-                <w:color w:val="000000"/>
-              </w:rPr>
-            </w:pPr>
-            <w:r xmlns:w="http://schemas.openxmlformats.org/wordprocessingml/2006/main" xmlns:wp="http://schemas.openxmlformats.org/drawingml/2006/wordprocessingDrawing" xmlns:r="http://schemas.openxmlformats.org/officeDocument/2006/relationships" xmlns:w14="http://schemas.microsoft.com/office/word/2010/wordml">
-              <w:rPr>
-                <w:rFonts w:ascii="Helvetica" w:hAnsi="Helvetica" w:eastAsia="Helvetica" w:cs="Helvetica"/>
-                <w:i w:val="false"/>
-                <w:b w:val="false"/>
-                <w:u w:val="none"/>
-                <w:strike w:val="false"/>
-                <w:sz w:val="22"/>
-                <w:szCs w:val="22"/>
-                <w:color w:val="000000"/>
-              </w:rPr>
-              <w:t xml:space="preserve">1.01</w:t>
-            </w:r>
-          </w:p>
-        </w:tc>
-        <w:tc>
-          <w:tcPr>
-            <w:tcBorders>
-              <w:bottom w:val="none" w:sz="0" w:space="0" w:color="000000"/>
-              <w:top w:val="none" w:sz="0" w:space="0" w:color="000000"/>
-              <w:left w:val="none" w:sz="0" w:space="0" w:color="000000"/>
-              <w:right w:val="none" w:sz="0" w:space="0" w:color="000000"/>
-            </w:tcBorders>
-            <w:shd w:val="clear" w:color="auto" w:fill="FFFFFF"/>
-            <w:tcMar>
-              <w:top w:w="0" w:type="dxa"/>
-              <w:bottom w:w="0" w:type="dxa"/>
-              <w:left w:w="0" w:type="dxa"/>
-              <w:right w:w="0" w:type="dxa"/>
-            </w:tcMar>
-            <w:vAlign w:val="center"/>
-          </w:tcPr>
-          <w:p>
-            <w:pPr>
-              <w:jc w:val="left"/>
-              <w:pBdr>
-                <w:bottom w:val="none" w:sz="0" w:space="0" w:color="000000"/>
-                <w:top w:val="none" w:sz="0" w:space="0" w:color="000000"/>
-                <w:left w:val="none" w:sz="0" w:space="0" w:color="000000"/>
-                <w:right w:val="none" w:sz="0" w:space="0" w:color="000000"/>
-              </w:pBdr>
-              <w:spacing w:after="100" w:before="100" w:line="240"/>
-              <w:ind w:left="100" w:right="100" w:firstLine="0" w:firstLineChars="0"/>
-              <w:rPr>
-                <w:rFonts w:ascii="Helvetica" w:hAnsi="Helvetica" w:eastAsia="Helvetica" w:cs="Helvetica"/>
-                <w:i w:val="false"/>
-                <w:b w:val="false"/>
-                <w:u w:val="none"/>
-                <w:strike w:val="false"/>
-                <w:sz w:val="22"/>
-                <w:szCs w:val="22"/>
-                <w:color w:val="000000"/>
-              </w:rPr>
-            </w:pPr>
-            <w:r xmlns:w="http://schemas.openxmlformats.org/wordprocessingml/2006/main" xmlns:wp="http://schemas.openxmlformats.org/drawingml/2006/wordprocessingDrawing" xmlns:r="http://schemas.openxmlformats.org/officeDocument/2006/relationships" xmlns:w14="http://schemas.microsoft.com/office/word/2010/wordml">
-              <w:rPr>
-                <w:rFonts w:ascii="Helvetica" w:hAnsi="Helvetica" w:eastAsia="Helvetica" w:cs="Helvetica"/>
-                <w:i w:val="false"/>
-                <w:b w:val="false"/>
-                <w:u w:val="none"/>
-                <w:strike w:val="false"/>
-                <w:sz w:val="22"/>
-                <w:szCs w:val="22"/>
-                <w:color w:val="000000"/>
-              </w:rPr>
-              <w:t xml:space="preserve">1.29</w:t>
             </w:r>
           </w:p>
         </w:tc>
@@ -10828,114 +10049,6 @@
                 <w:szCs w:val="22"/>
                 <w:color w:val="000000"/>
               </w:rPr>
-              <w:t xml:space="preserve">1.20</w:t>
-            </w:r>
-          </w:p>
-        </w:tc>
-        <w:tc>
-          <w:tcPr>
-            <w:tcBorders>
-              <w:bottom w:val="none" w:sz="0" w:space="0" w:color="000000"/>
-              <w:top w:val="none" w:sz="0" w:space="0" w:color="000000"/>
-              <w:left w:val="none" w:sz="0" w:space="0" w:color="000000"/>
-              <w:right w:val="none" w:sz="0" w:space="0" w:color="000000"/>
-            </w:tcBorders>
-            <w:shd w:val="clear" w:color="auto" w:fill="FFFFFF"/>
-            <w:tcMar>
-              <w:top w:w="0" w:type="dxa"/>
-              <w:bottom w:w="0" w:type="dxa"/>
-              <w:left w:w="0" w:type="dxa"/>
-              <w:right w:w="0" w:type="dxa"/>
-            </w:tcMar>
-            <w:vAlign w:val="center"/>
-          </w:tcPr>
-          <w:p>
-            <w:pPr>
-              <w:jc w:val="left"/>
-              <w:pBdr>
-                <w:bottom w:val="none" w:sz="0" w:space="0" w:color="000000"/>
-                <w:top w:val="none" w:sz="0" w:space="0" w:color="000000"/>
-                <w:left w:val="none" w:sz="0" w:space="0" w:color="000000"/>
-                <w:right w:val="none" w:sz="0" w:space="0" w:color="000000"/>
-              </w:pBdr>
-              <w:spacing w:after="100" w:before="100" w:line="240"/>
-              <w:ind w:left="100" w:right="100" w:firstLine="0" w:firstLineChars="0"/>
-              <w:rPr>
-                <w:rFonts w:ascii="Helvetica" w:hAnsi="Helvetica" w:eastAsia="Helvetica" w:cs="Helvetica"/>
-                <w:i w:val="false"/>
-                <w:b w:val="false"/>
-                <w:u w:val="none"/>
-                <w:strike w:val="false"/>
-                <w:sz w:val="22"/>
-                <w:szCs w:val="22"/>
-                <w:color w:val="000000"/>
-              </w:rPr>
-            </w:pPr>
-            <w:r xmlns:w="http://schemas.openxmlformats.org/wordprocessingml/2006/main" xmlns:wp="http://schemas.openxmlformats.org/drawingml/2006/wordprocessingDrawing" xmlns:r="http://schemas.openxmlformats.org/officeDocument/2006/relationships" xmlns:w14="http://schemas.microsoft.com/office/word/2010/wordml">
-              <w:rPr>
-                <w:rFonts w:ascii="Helvetica" w:hAnsi="Helvetica" w:eastAsia="Helvetica" w:cs="Helvetica"/>
-                <w:i w:val="false"/>
-                <w:b w:val="false"/>
-                <w:u w:val="none"/>
-                <w:strike w:val="false"/>
-                <w:sz w:val="22"/>
-                <w:szCs w:val="22"/>
-                <w:color w:val="000000"/>
-              </w:rPr>
-              <w:t xml:space="preserve">2.22</w:t>
-            </w:r>
-          </w:p>
-        </w:tc>
-        <w:tc>
-          <w:tcPr>
-            <w:tcBorders>
-              <w:bottom w:val="none" w:sz="0" w:space="0" w:color="000000"/>
-              <w:top w:val="none" w:sz="0" w:space="0" w:color="000000"/>
-              <w:left w:val="none" w:sz="0" w:space="0" w:color="000000"/>
-              <w:right w:val="none" w:sz="0" w:space="0" w:color="000000"/>
-            </w:tcBorders>
-            <w:shd w:val="clear" w:color="auto" w:fill="FFFFFF"/>
-            <w:tcMar>
-              <w:top w:w="0" w:type="dxa"/>
-              <w:bottom w:w="0" w:type="dxa"/>
-              <w:left w:w="0" w:type="dxa"/>
-              <w:right w:w="0" w:type="dxa"/>
-            </w:tcMar>
-            <w:vAlign w:val="center"/>
-          </w:tcPr>
-          <w:p>
-            <w:pPr>
-              <w:jc w:val="left"/>
-              <w:pBdr>
-                <w:bottom w:val="none" w:sz="0" w:space="0" w:color="000000"/>
-                <w:top w:val="none" w:sz="0" w:space="0" w:color="000000"/>
-                <w:left w:val="none" w:sz="0" w:space="0" w:color="000000"/>
-                <w:right w:val="none" w:sz="0" w:space="0" w:color="000000"/>
-              </w:pBdr>
-              <w:spacing w:after="100" w:before="100" w:line="240"/>
-              <w:ind w:left="100" w:right="100" w:firstLine="0" w:firstLineChars="0"/>
-              <w:rPr>
-                <w:rFonts w:ascii="Helvetica" w:hAnsi="Helvetica" w:eastAsia="Helvetica" w:cs="Helvetica"/>
-                <w:i w:val="false"/>
-                <w:b w:val="false"/>
-                <w:u w:val="none"/>
-                <w:strike w:val="false"/>
-                <w:sz w:val="22"/>
-                <w:szCs w:val="22"/>
-                <w:color w:val="000000"/>
-              </w:rPr>
-            </w:pPr>
-            <w:r xmlns:w="http://schemas.openxmlformats.org/wordprocessingml/2006/main" xmlns:wp="http://schemas.openxmlformats.org/drawingml/2006/wordprocessingDrawing" xmlns:r="http://schemas.openxmlformats.org/officeDocument/2006/relationships" xmlns:w14="http://schemas.microsoft.com/office/word/2010/wordml">
-              <w:rPr>
-                <w:rFonts w:ascii="Helvetica" w:hAnsi="Helvetica" w:eastAsia="Helvetica" w:cs="Helvetica"/>
-                <w:i w:val="false"/>
-                <w:b w:val="false"/>
-                <w:u w:val="none"/>
-                <w:strike w:val="false"/>
-                <w:sz w:val="22"/>
-                <w:szCs w:val="22"/>
-                <w:color w:val="000000"/>
-              </w:rPr>
               <w:t xml:space="preserve">[1.20, 2.22]</w:t>
             </w:r>
           </w:p>
@@ -11103,114 +10216,6 @@
                 <w:szCs w:val="22"/>
                 <w:color w:val="000000"/>
               </w:rPr>
-              <w:t xml:space="preserve">1.08</w:t>
-            </w:r>
-          </w:p>
-        </w:tc>
-        <w:tc>
-          <w:tcPr>
-            <w:tcBorders>
-              <w:bottom w:val="single" w:sz="12" w:space="0" w:color="666666"/>
-              <w:top w:val="none" w:sz="0" w:space="0" w:color="000000"/>
-              <w:left w:val="none" w:sz="0" w:space="0" w:color="000000"/>
-              <w:right w:val="none" w:sz="0" w:space="0" w:color="000000"/>
-            </w:tcBorders>
-            <w:shd w:val="clear" w:color="auto" w:fill="FFFFFF"/>
-            <w:tcMar>
-              <w:top w:w="0" w:type="dxa"/>
-              <w:bottom w:w="0" w:type="dxa"/>
-              <w:left w:w="0" w:type="dxa"/>
-              <w:right w:w="0" w:type="dxa"/>
-            </w:tcMar>
-            <w:vAlign w:val="center"/>
-          </w:tcPr>
-          <w:p>
-            <w:pPr>
-              <w:jc w:val="left"/>
-              <w:pBdr>
-                <w:bottom w:val="none" w:sz="0" w:space="0" w:color="000000"/>
-                <w:top w:val="none" w:sz="0" w:space="0" w:color="000000"/>
-                <w:left w:val="none" w:sz="0" w:space="0" w:color="000000"/>
-                <w:right w:val="none" w:sz="0" w:space="0" w:color="000000"/>
-              </w:pBdr>
-              <w:spacing w:after="100" w:before="100" w:line="240"/>
-              <w:ind w:left="100" w:right="100" w:firstLine="0" w:firstLineChars="0"/>
-              <w:rPr>
-                <w:rFonts w:ascii="Helvetica" w:hAnsi="Helvetica" w:eastAsia="Helvetica" w:cs="Helvetica"/>
-                <w:i w:val="false"/>
-                <w:b w:val="false"/>
-                <w:u w:val="none"/>
-                <w:strike w:val="false"/>
-                <w:sz w:val="22"/>
-                <w:szCs w:val="22"/>
-                <w:color w:val="000000"/>
-              </w:rPr>
-            </w:pPr>
-            <w:r xmlns:w="http://schemas.openxmlformats.org/wordprocessingml/2006/main" xmlns:wp="http://schemas.openxmlformats.org/drawingml/2006/wordprocessingDrawing" xmlns:r="http://schemas.openxmlformats.org/officeDocument/2006/relationships" xmlns:w14="http://schemas.microsoft.com/office/word/2010/wordml">
-              <w:rPr>
-                <w:rFonts w:ascii="Helvetica" w:hAnsi="Helvetica" w:eastAsia="Helvetica" w:cs="Helvetica"/>
-                <w:i w:val="false"/>
-                <w:b w:val="false"/>
-                <w:u w:val="none"/>
-                <w:strike w:val="false"/>
-                <w:sz w:val="22"/>
-                <w:szCs w:val="22"/>
-                <w:color w:val="000000"/>
-              </w:rPr>
-              <w:t xml:space="preserve">2.59</w:t>
-            </w:r>
-          </w:p>
-        </w:tc>
-        <w:tc>
-          <w:tcPr>
-            <w:tcBorders>
-              <w:bottom w:val="single" w:sz="12" w:space="0" w:color="666666"/>
-              <w:top w:val="none" w:sz="0" w:space="0" w:color="000000"/>
-              <w:left w:val="none" w:sz="0" w:space="0" w:color="000000"/>
-              <w:right w:val="none" w:sz="0" w:space="0" w:color="000000"/>
-            </w:tcBorders>
-            <w:shd w:val="clear" w:color="auto" w:fill="FFFFFF"/>
-            <w:tcMar>
-              <w:top w:w="0" w:type="dxa"/>
-              <w:bottom w:w="0" w:type="dxa"/>
-              <w:left w:w="0" w:type="dxa"/>
-              <w:right w:w="0" w:type="dxa"/>
-            </w:tcMar>
-            <w:vAlign w:val="center"/>
-          </w:tcPr>
-          <w:p>
-            <w:pPr>
-              <w:jc w:val="left"/>
-              <w:pBdr>
-                <w:bottom w:val="none" w:sz="0" w:space="0" w:color="000000"/>
-                <w:top w:val="none" w:sz="0" w:space="0" w:color="000000"/>
-                <w:left w:val="none" w:sz="0" w:space="0" w:color="000000"/>
-                <w:right w:val="none" w:sz="0" w:space="0" w:color="000000"/>
-              </w:pBdr>
-              <w:spacing w:after="100" w:before="100" w:line="240"/>
-              <w:ind w:left="100" w:right="100" w:firstLine="0" w:firstLineChars="0"/>
-              <w:rPr>
-                <w:rFonts w:ascii="Helvetica" w:hAnsi="Helvetica" w:eastAsia="Helvetica" w:cs="Helvetica"/>
-                <w:i w:val="false"/>
-                <w:b w:val="false"/>
-                <w:u w:val="none"/>
-                <w:strike w:val="false"/>
-                <w:sz w:val="22"/>
-                <w:szCs w:val="22"/>
-                <w:color w:val="000000"/>
-              </w:rPr>
-            </w:pPr>
-            <w:r xmlns:w="http://schemas.openxmlformats.org/wordprocessingml/2006/main" xmlns:wp="http://schemas.openxmlformats.org/drawingml/2006/wordprocessingDrawing" xmlns:r="http://schemas.openxmlformats.org/officeDocument/2006/relationships" xmlns:w14="http://schemas.microsoft.com/office/word/2010/wordml">
-              <w:rPr>
-                <w:rFonts w:ascii="Helvetica" w:hAnsi="Helvetica" w:eastAsia="Helvetica" w:cs="Helvetica"/>
-                <w:i w:val="false"/>
-                <w:b w:val="false"/>
-                <w:u w:val="none"/>
-                <w:strike w:val="false"/>
-                <w:sz w:val="22"/>
-                <w:szCs w:val="22"/>
-                <w:color w:val="000000"/>
-              </w:rPr>
               <w:t xml:space="preserve">[1.08, 2.59]</w:t>
             </w:r>
           </w:p>
@@ -11241,7 +10246,7 @@
           <wp:inline>
             <wp:extent cx="5727700" cy="1908334"/>
             <wp:effectExtent b="0" l="0" r="0" t="0"/>
-            <wp:docPr descr="Figure 1: Sampling distributions of transition rates for the focal single-MPM example (Agrimonia eupatoria, population B), showing transition rates as reported in COMPADRE (A), the underlying transition counts used for estimation (B), and bootstrap-based sampling distributions (C). In panel C, pale green densities show transition-rate sampling distributions, and teal dashed horizontal lines mark point estimates. Survival-related transitions are probabilities; the reproductive transition gives recruits per reproductive plant. Together, these panels show that several matrix elements are weakly estimated from finite samples." title="" id="92" name="Picture"/>
+            <wp:docPr descr="Figure 1: Sampling distributions of transition rates for the focal single-MPM example (Agrimonia eupatoria, population B), showing transition rates as reported in COMPADRE (A), the underlying transition counts used for estimation (B), and posterior uncertainty distributions (C). In panel C, pale green densities show transition-rate sampling distributions, and teal dashed horizontal lines mark point estimates. Survival-related transitions are probabilities; the reproductive transition gives recruits per reproductive plant. Together, these panels show that several matrix elements are weakly estimated from finite samples." title="" id="92" name="Picture"/>
             <a:graphic>
               <a:graphicData uri="http://schemas.openxmlformats.org/drawingml/2006/picture">
                 <pic:pic>
@@ -11296,7 +10301,7 @@
         <w:t xml:space="preserve">Agrimonia eupatoria</w:t>
       </w:r>
       <w:r>
-        <w:t xml:space="preserve">, population B), showing transition rates as reported in COMPADRE (A), the underlying transition counts used for estimation (B), and bootstrap-based sampling distributions (C). In panel C, pale green densities show transition-rate sampling distributions, and teal dashed horizontal lines mark point estimates. Survival-related transitions are probabilities; the reproductive transition gives recruits per reproductive plant. Together, these panels show that several matrix elements are weakly estimated from finite samples.</w:t>
+        <w:t xml:space="preserve">, population B), showing transition rates as reported in COMPADRE (A), the underlying transition counts used for estimation (B), and posterior uncertainty distributions (C). In panel C, pale green densities show transition-rate sampling distributions, and teal dashed horizontal lines mark point estimates. Survival-related transitions are probabilities; the reproductive transition gives recruits per reproductive plant. Together, these panels show that several matrix elements are weakly estimated from finite samples.</w:t>
       </w:r>
     </w:p>
     <w:p>
@@ -11442,7 +10447,7 @@
               <a:graphicData uri="http://schemas.openxmlformats.org/drawingml/2006/picture">
                 <pic:pic>
                   <pic:nvPicPr>
-                    <pic:cNvPr descr="sampling_uncertainty_mpm_main_files/1fd9b0e750f950e9f3ad09787ffb37149bd9fb00.png" id="105" name="Picture"/>
+                    <pic:cNvPr descr="sampling_uncertainty_mpm_main_files/7c9ac97e04e15033da8eb02c12609c6ff06b67c9.png" id="105" name="Picture"/>
                     <pic:cNvPicPr>
                       <a:picLocks noChangeArrowheads="1" noChangeAspect="1"/>
                     </pic:cNvPicPr>
@@ -11583,12 +10588,12 @@
           <wp:inline>
             <wp:extent cx="5727700" cy="4455476"/>
             <wp:effectExtent b="0" l="0" r="0" t="0"/>
-            <wp:docPr descr="Figure 6: Simulation analysis of climate effects on fecundity, showing that accounting for sampling uncertainty improves interval performance while keeping bias low. The upper row shows bias, and the lower row shows 95% interval coverage, across four sample sizes and three true effect sizes (beta = 0.1, 0.3, and 0.5). The Gaussian point-estimate model (purple) becomes increasingly biased as the true effect grows. The Poisson point-estimate model (blue) is nearly unbiased but its intervals miss the true effect too often, especially at larger sample sizes. The uncertainty-aware Poisson model (green) keeps coverage close to the expected 95% level across the full design." title="" id="112" name="Picture"/>
+            <wp:docPr descr="Figure 6: Simulation analysis of climate effects on fecundity, showing that modelling year-to-year process variation improves interval performance while keeping bias low. The upper row shows bias, and the lower row shows 95% interval coverage, across four sample sizes and three true effect sizes (beta = 0.1, 0.3, and 0.5). The Gaussian log-link point-estimate model (purple) has little average bias but undercovers, especially at stronger climate effects. The Poisson point-estimate model (blue) is nearly unbiased but its intervals miss the true effect too often, especially at larger sample sizes. The uncertainty-aware Poisson model (green) keeps coverage close to the expected 95% level across the full design." title="" id="112" name="Picture"/>
             <a:graphic>
               <a:graphicData uri="http://schemas.openxmlformats.org/drawingml/2006/picture">
                 <pic:pic>
                   <pic:nvPicPr>
-                    <pic:cNvPr descr="sampling_uncertainty_mpm_main_files/de5c323961f05beb78df7a05b26b0aa139ba5382.png" id="113" name="Picture"/>
+                    <pic:cNvPr descr="sampling_uncertainty_mpm_main_files/d55ce53c4bbd0e5d0036a5a9bf2b0c3c47fdc349.png" id="113" name="Picture"/>
                     <pic:cNvPicPr>
                       <a:picLocks noChangeArrowheads="1" noChangeAspect="1"/>
                     </pic:cNvPicPr>
@@ -11628,7 +10633,7 @@
       <w:bookmarkStart w:id="114" w:name="fig:fig-main-5"/>
       <w:bookmarkEnd w:id="114"/>
       <w:r>
-        <w:t xml:space="preserve">Figure 6: Simulation analysis of climate effects on fecundity, showing that accounting for sampling uncertainty improves interval performance while keeping bias low. The upper row shows bias, and the lower row shows 95% interval coverage, across four sample sizes and three true effect sizes (beta = 0.1, 0.3, and 0.5). The Gaussian point-estimate model (purple) becomes increasingly biased as the true effect grows. The Poisson point-estimate model (blue) is nearly unbiased but its intervals miss the true effect too often, especially at larger sample sizes. The uncertainty-aware Poisson model (green) keeps coverage close to the expected 95% level across the full design.</w:t>
+        <w:t xml:space="preserve">Figure 6: Simulation analysis of climate effects on fecundity, showing that modelling year-to-year process variation improves interval performance while keeping bias low. The upper row shows bias, and the lower row shows 95% interval coverage, across four sample sizes and three true effect sizes (beta = 0.1, 0.3, and 0.5). The Gaussian log-link point-estimate model (purple) has little average bias but undercovers, especially at stronger climate effects. The Poisson point-estimate model (blue) is nearly unbiased but its intervals miss the true effect too often, especially at larger sample sizes. The uncertainty-aware Poisson model (green) keeps coverage close to the expected 95% level across the full design.</w:t>
       </w:r>
     </w:p>
     <w:bookmarkEnd w:id="115"/>

</xml_diff>